<commit_message>
docs: show all ten screens in the interface appendix and answer the A3 feedback point by point
</commit_message>
<xml_diff>
--- a/docs/docx/interface-design.docx
+++ b/docs/docx/interface-design.docx
@@ -1121,7 +1121,15 @@
         <w:spacing w:after="120"/>
       </w:pPr>
       <w:r>
-        <w:t xml:space="preserve">Current screenshots live in </w:t>
+        <w:t>All ten screens of the implemented console, captured from the running Azure</w:t>
+      </w:r>
+    </w:p>
+    <w:p>
+      <w:pPr>
+        <w:spacing w:after="120"/>
+      </w:pPr>
+      <w:r>
+        <w:t xml:space="preserve">deployment with the simulator on (source files in </w:t>
       </w:r>
       <w:r>
         <w:rPr>
@@ -1132,7 +1140,7 @@
         <w:t>docs/screenshots/</w:t>
       </w:r>
       <w:r>
-        <w:t xml:space="preserve"> (taken from the running system,</w:t>
+        <w:t>). The A3</w:t>
       </w:r>
     </w:p>
     <w:p>
@@ -1140,7 +1148,589 @@
         <w:spacing w:after="120"/>
       </w:pPr>
       <w:r>
-        <w:t>simulator on). Screen-by-screen purpose is unchanged from A3 section 3.3.</w:t>
+        <w:t>feedback asked to see every designed screen, so they are all here, ordered the</w:t>
+      </w:r>
+    </w:p>
+    <w:p>
+      <w:pPr>
+        <w:spacing w:after="120"/>
+      </w:pPr>
+      <w:r>
+        <w:t>way a user meets them: entry, then the Compliance Officer triage journey, then</w:t>
+      </w:r>
+    </w:p>
+    <w:p>
+      <w:pPr>
+        <w:spacing w:after="120"/>
+      </w:pPr>
+      <w:r>
+        <w:t>the DevSecOps configuration journey.</w:t>
+      </w:r>
+    </w:p>
+    <w:p>
+      <w:pPr>
+        <w:spacing w:after="120"/>
+      </w:pPr>
+      <w:r>
+        <w:rPr>
+          <w:b/>
+          <w:color w:val="1B3A6B"/>
+        </w:rPr>
+        <w:t>Landing page</w:t>
+      </w:r>
+      <w:r>
+        <w:t xml:space="preserve"> - the public "what is this" story before any login.</w:t>
+      </w:r>
+    </w:p>
+    <w:p>
+      <w:r>
+        <w:drawing>
+          <wp:inline xmlns:a="http://schemas.openxmlformats.org/drawingml/2006/main" xmlns:pic="http://schemas.openxmlformats.org/drawingml/2006/picture">
+            <wp:extent cx="5852160" cy="3291840"/>
+            <wp:docPr id="2" name="Picture 2"/>
+            <wp:cNvGraphicFramePr>
+              <a:graphicFrameLocks noChangeAspect="1"/>
+            </wp:cNvGraphicFramePr>
+            <a:graphic>
+              <a:graphicData uri="http://schemas.openxmlformats.org/drawingml/2006/picture">
+                <pic:pic>
+                  <pic:nvPicPr>
+                    <pic:cNvPr id="0" name="shot-landing.png"/>
+                    <pic:cNvPicPr/>
+                  </pic:nvPicPr>
+                  <pic:blipFill>
+                    <a:blip r:embed="rId11"/>
+                    <a:stretch>
+                      <a:fillRect/>
+                    </a:stretch>
+                  </pic:blipFill>
+                  <pic:spPr>
+                    <a:xfrm>
+                      <a:off x="0" y="0"/>
+                      <a:ext cx="5852160" cy="3291840"/>
+                    </a:xfrm>
+                    <a:prstGeom prst="rect"/>
+                  </pic:spPr>
+                </pic:pic>
+              </a:graphicData>
+            </a:graphic>
+          </wp:inline>
+        </w:drawing>
+      </w:r>
+    </w:p>
+    <w:p>
+      <w:pPr>
+        <w:spacing w:after="120"/>
+      </w:pPr>
+      <w:r>
+        <w:rPr>
+          <w:b/>
+          <w:color w:val="1B3A6B"/>
+        </w:rPr>
+        <w:t>Login</w:t>
+      </w:r>
+      <w:r>
+        <w:t xml:space="preserve"> - JWT email/password with the SSO placeholder (change 1 in section 2).</w:t>
+      </w:r>
+    </w:p>
+    <w:p>
+      <w:r>
+        <w:drawing>
+          <wp:inline xmlns:a="http://schemas.openxmlformats.org/drawingml/2006/main" xmlns:pic="http://schemas.openxmlformats.org/drawingml/2006/picture">
+            <wp:extent cx="5852160" cy="3291840"/>
+            <wp:docPr id="3" name="Picture 3"/>
+            <wp:cNvGraphicFramePr>
+              <a:graphicFrameLocks noChangeAspect="1"/>
+            </wp:cNvGraphicFramePr>
+            <a:graphic>
+              <a:graphicData uri="http://schemas.openxmlformats.org/drawingml/2006/picture">
+                <pic:pic>
+                  <pic:nvPicPr>
+                    <pic:cNvPr id="0" name="shot-login.png"/>
+                    <pic:cNvPicPr/>
+                  </pic:nvPicPr>
+                  <pic:blipFill>
+                    <a:blip r:embed="rId12"/>
+                    <a:stretch>
+                      <a:fillRect/>
+                    </a:stretch>
+                  </pic:blipFill>
+                  <pic:spPr>
+                    <a:xfrm>
+                      <a:off x="0" y="0"/>
+                      <a:ext cx="5852160" cy="3291840"/>
+                    </a:xfrm>
+                    <a:prstGeom prst="rect"/>
+                  </pic:spPr>
+                </pic:pic>
+              </a:graphicData>
+            </a:graphic>
+          </wp:inline>
+        </w:drawing>
+      </w:r>
+    </w:p>
+    <w:p>
+      <w:pPr>
+        <w:spacing w:after="120"/>
+      </w:pPr>
+      <w:r>
+        <w:rPr>
+          <w:b/>
+          <w:color w:val="1B3A6B"/>
+        </w:rPr>
+        <w:t>Dashboard</w:t>
+      </w:r>
+      <w:r>
+        <w:t xml:space="preserve"> - live KPIs, intercepted-actions feed, risk mix. The Compliance</w:t>
+      </w:r>
+    </w:p>
+    <w:p>
+      <w:pPr>
+        <w:spacing w:after="120"/>
+      </w:pPr>
+      <w:r>
+        <w:t>Officer's home screen.</w:t>
+      </w:r>
+    </w:p>
+    <w:p>
+      <w:r>
+        <w:drawing>
+          <wp:inline xmlns:a="http://schemas.openxmlformats.org/drawingml/2006/main" xmlns:pic="http://schemas.openxmlformats.org/drawingml/2006/picture">
+            <wp:extent cx="5852160" cy="3291840"/>
+            <wp:docPr id="4" name="Picture 4"/>
+            <wp:cNvGraphicFramePr>
+              <a:graphicFrameLocks noChangeAspect="1"/>
+            </wp:cNvGraphicFramePr>
+            <a:graphic>
+              <a:graphicData uri="http://schemas.openxmlformats.org/drawingml/2006/picture">
+                <pic:pic>
+                  <pic:nvPicPr>
+                    <pic:cNvPr id="0" name="shot-dashboard.png"/>
+                    <pic:cNvPicPr/>
+                  </pic:nvPicPr>
+                  <pic:blipFill>
+                    <a:blip r:embed="rId13"/>
+                    <a:stretch>
+                      <a:fillRect/>
+                    </a:stretch>
+                  </pic:blipFill>
+                  <pic:spPr>
+                    <a:xfrm>
+                      <a:off x="0" y="0"/>
+                      <a:ext cx="5852160" cy="3291840"/>
+                    </a:xfrm>
+                    <a:prstGeom prst="rect"/>
+                  </pic:spPr>
+                </pic:pic>
+              </a:graphicData>
+            </a:graphic>
+          </wp:inline>
+        </w:drawing>
+      </w:r>
+    </w:p>
+    <w:p>
+      <w:pPr>
+        <w:spacing w:after="120"/>
+      </w:pPr>
+      <w:r>
+        <w:rPr>
+          <w:b/>
+          <w:color w:val="1B3A6B"/>
+        </w:rPr>
+        <w:t>Approval queue</w:t>
+      </w:r>
+      <w:r>
+        <w:t xml:space="preserve"> - the human-in-the-loop worklist; expandable rows carry the</w:t>
+      </w:r>
+    </w:p>
+    <w:p>
+      <w:pPr>
+        <w:spacing w:after="120"/>
+      </w:pPr>
+      <w:r>
+        <w:t>full decision context, approve/deny act on the live API.</w:t>
+      </w:r>
+    </w:p>
+    <w:p>
+      <w:r>
+        <w:drawing>
+          <wp:inline xmlns:a="http://schemas.openxmlformats.org/drawingml/2006/main" xmlns:pic="http://schemas.openxmlformats.org/drawingml/2006/picture">
+            <wp:extent cx="5852160" cy="3291840"/>
+            <wp:docPr id="5" name="Picture 5"/>
+            <wp:cNvGraphicFramePr>
+              <a:graphicFrameLocks noChangeAspect="1"/>
+            </wp:cNvGraphicFramePr>
+            <a:graphic>
+              <a:graphicData uri="http://schemas.openxmlformats.org/drawingml/2006/picture">
+                <pic:pic>
+                  <pic:nvPicPr>
+                    <pic:cNvPr id="0" name="shot-queue.png"/>
+                    <pic:cNvPicPr/>
+                  </pic:nvPicPr>
+                  <pic:blipFill>
+                    <a:blip r:embed="rId14"/>
+                    <a:stretch>
+                      <a:fillRect/>
+                    </a:stretch>
+                  </pic:blipFill>
+                  <pic:spPr>
+                    <a:xfrm>
+                      <a:off x="0" y="0"/>
+                      <a:ext cx="5852160" cy="3291840"/>
+                    </a:xfrm>
+                    <a:prstGeom prst="rect"/>
+                  </pic:spPr>
+                </pic:pic>
+              </a:graphicData>
+            </a:graphic>
+          </wp:inline>
+        </w:drawing>
+      </w:r>
+    </w:p>
+    <w:p>
+      <w:pPr>
+        <w:spacing w:after="120"/>
+      </w:pPr>
+      <w:r>
+        <w:rPr>
+          <w:b/>
+          <w:color w:val="1B3A6B"/>
+        </w:rPr>
+        <w:t>Audit log</w:t>
+      </w:r>
+      <w:r>
+        <w:t xml:space="preserve"> - the hash-chained record with per-row chain hashes and the</w:t>
+      </w:r>
+    </w:p>
+    <w:p>
+      <w:pPr>
+        <w:spacing w:after="120"/>
+      </w:pPr>
+      <w:r>
+        <w:t>one-click Verify chain action.</w:t>
+      </w:r>
+    </w:p>
+    <w:p>
+      <w:r>
+        <w:drawing>
+          <wp:inline xmlns:a="http://schemas.openxmlformats.org/drawingml/2006/main" xmlns:pic="http://schemas.openxmlformats.org/drawingml/2006/picture">
+            <wp:extent cx="5852160" cy="3291840"/>
+            <wp:docPr id="6" name="Picture 6"/>
+            <wp:cNvGraphicFramePr>
+              <a:graphicFrameLocks noChangeAspect="1"/>
+            </wp:cNvGraphicFramePr>
+            <a:graphic>
+              <a:graphicData uri="http://schemas.openxmlformats.org/drawingml/2006/picture">
+                <pic:pic>
+                  <pic:nvPicPr>
+                    <pic:cNvPr id="0" name="shot-audit.png"/>
+                    <pic:cNvPicPr/>
+                  </pic:nvPicPr>
+                  <pic:blipFill>
+                    <a:blip r:embed="rId15"/>
+                    <a:stretch>
+                      <a:fillRect/>
+                    </a:stretch>
+                  </pic:blipFill>
+                  <pic:spPr>
+                    <a:xfrm>
+                      <a:off x="0" y="0"/>
+                      <a:ext cx="5852160" cy="3291840"/>
+                    </a:xfrm>
+                    <a:prstGeom prst="rect"/>
+                  </pic:spPr>
+                </pic:pic>
+              </a:graphicData>
+            </a:graphic>
+          </wp:inline>
+        </w:drawing>
+      </w:r>
+    </w:p>
+    <w:p>
+      <w:pPr>
+        <w:spacing w:after="120"/>
+      </w:pPr>
+      <w:r>
+        <w:rPr>
+          <w:b/>
+          <w:color w:val="1B3A6B"/>
+        </w:rPr>
+        <w:t>Reports and compliance</w:t>
+      </w:r>
+      <w:r>
+        <w:t xml:space="preserve"> - exportable compliance posture over time.</w:t>
+      </w:r>
+    </w:p>
+    <w:p>
+      <w:r>
+        <w:drawing>
+          <wp:inline xmlns:a="http://schemas.openxmlformats.org/drawingml/2006/main" xmlns:pic="http://schemas.openxmlformats.org/drawingml/2006/picture">
+            <wp:extent cx="5852160" cy="3291840"/>
+            <wp:docPr id="7" name="Picture 7"/>
+            <wp:cNvGraphicFramePr>
+              <a:graphicFrameLocks noChangeAspect="1"/>
+            </wp:cNvGraphicFramePr>
+            <a:graphic>
+              <a:graphicData uri="http://schemas.openxmlformats.org/drawingml/2006/picture">
+                <pic:pic>
+                  <pic:nvPicPr>
+                    <pic:cNvPr id="0" name="shot-reports.png"/>
+                    <pic:cNvPicPr/>
+                  </pic:nvPicPr>
+                  <pic:blipFill>
+                    <a:blip r:embed="rId16"/>
+                    <a:stretch>
+                      <a:fillRect/>
+                    </a:stretch>
+                  </pic:blipFill>
+                  <pic:spPr>
+                    <a:xfrm>
+                      <a:off x="0" y="0"/>
+                      <a:ext cx="5852160" cy="3291840"/>
+                    </a:xfrm>
+                    <a:prstGeom prst="rect"/>
+                  </pic:spPr>
+                </pic:pic>
+              </a:graphicData>
+            </a:graphic>
+          </wp:inline>
+        </w:drawing>
+      </w:r>
+    </w:p>
+    <w:p>
+      <w:pPr>
+        <w:spacing w:after="120"/>
+      </w:pPr>
+      <w:r>
+        <w:rPr>
+          <w:b/>
+          <w:color w:val="1B3A6B"/>
+        </w:rPr>
+        <w:t>Agent overview</w:t>
+      </w:r>
+      <w:r>
+        <w:t xml:space="preserve"> - fleet status at a glance; the DevSecOps entry point.</w:t>
+      </w:r>
+    </w:p>
+    <w:p>
+      <w:r>
+        <w:drawing>
+          <wp:inline xmlns:a="http://schemas.openxmlformats.org/drawingml/2006/main" xmlns:pic="http://schemas.openxmlformats.org/drawingml/2006/picture">
+            <wp:extent cx="5852160" cy="3291840"/>
+            <wp:docPr id="8" name="Picture 8"/>
+            <wp:cNvGraphicFramePr>
+              <a:graphicFrameLocks noChangeAspect="1"/>
+            </wp:cNvGraphicFramePr>
+            <a:graphic>
+              <a:graphicData uri="http://schemas.openxmlformats.org/drawingml/2006/picture">
+                <pic:pic>
+                  <pic:nvPicPr>
+                    <pic:cNvPr id="0" name="shot-agents.png"/>
+                    <pic:cNvPicPr/>
+                  </pic:nvPicPr>
+                  <pic:blipFill>
+                    <a:blip r:embed="rId17"/>
+                    <a:stretch>
+                      <a:fillRect/>
+                    </a:stretch>
+                  </pic:blipFill>
+                  <pic:spPr>
+                    <a:xfrm>
+                      <a:off x="0" y="0"/>
+                      <a:ext cx="5852160" cy="3291840"/>
+                    </a:xfrm>
+                    <a:prstGeom prst="rect"/>
+                  </pic:spPr>
+                </pic:pic>
+              </a:graphicData>
+            </a:graphic>
+          </wp:inline>
+        </w:drawing>
+      </w:r>
+    </w:p>
+    <w:p>
+      <w:pPr>
+        <w:spacing w:after="120"/>
+      </w:pPr>
+      <w:r>
+        <w:rPr>
+          <w:b/>
+          <w:color w:val="1B3A6B"/>
+        </w:rPr>
+        <w:t>Agent registry</w:t>
+      </w:r>
+      <w:r>
+        <w:t xml:space="preserve"> - per-agent detail, permitted action types, live counters.</w:t>
+      </w:r>
+    </w:p>
+    <w:p>
+      <w:r>
+        <w:drawing>
+          <wp:inline xmlns:a="http://schemas.openxmlformats.org/drawingml/2006/main" xmlns:pic="http://schemas.openxmlformats.org/drawingml/2006/picture">
+            <wp:extent cx="5852160" cy="3291840"/>
+            <wp:docPr id="9" name="Picture 9"/>
+            <wp:cNvGraphicFramePr>
+              <a:graphicFrameLocks noChangeAspect="1"/>
+            </wp:cNvGraphicFramePr>
+            <a:graphic>
+              <a:graphicData uri="http://schemas.openxmlformats.org/drawingml/2006/picture">
+                <pic:pic>
+                  <pic:nvPicPr>
+                    <pic:cNvPr id="0" name="shot-registry.png"/>
+                    <pic:cNvPicPr/>
+                  </pic:nvPicPr>
+                  <pic:blipFill>
+                    <a:blip r:embed="rId18"/>
+                    <a:stretch>
+                      <a:fillRect/>
+                    </a:stretch>
+                  </pic:blipFill>
+                  <pic:spPr>
+                    <a:xfrm>
+                      <a:off x="0" y="0"/>
+                      <a:ext cx="5852160" cy="3291840"/>
+                    </a:xfrm>
+                    <a:prstGeom prst="rect"/>
+                  </pic:spPr>
+                </pic:pic>
+              </a:graphicData>
+            </a:graphic>
+          </wp:inline>
+        </w:drawing>
+      </w:r>
+    </w:p>
+    <w:p>
+      <w:pPr>
+        <w:spacing w:after="120"/>
+      </w:pPr>
+      <w:r>
+        <w:rPr>
+          <w:b/>
+          <w:color w:val="1B3A6B"/>
+        </w:rPr>
+        <w:t>Policy rules</w:t>
+      </w:r>
+      <w:r>
+        <w:t xml:space="preserve"> - policy CRUD plus the pre-built rule library.</w:t>
+      </w:r>
+    </w:p>
+    <w:p>
+      <w:r>
+        <w:drawing>
+          <wp:inline xmlns:a="http://schemas.openxmlformats.org/drawingml/2006/main" xmlns:pic="http://schemas.openxmlformats.org/drawingml/2006/picture">
+            <wp:extent cx="5852160" cy="3291840"/>
+            <wp:docPr id="10" name="Picture 10"/>
+            <wp:cNvGraphicFramePr>
+              <a:graphicFrameLocks noChangeAspect="1"/>
+            </wp:cNvGraphicFramePr>
+            <a:graphic>
+              <a:graphicData uri="http://schemas.openxmlformats.org/drawingml/2006/picture">
+                <pic:pic>
+                  <pic:nvPicPr>
+                    <pic:cNvPr id="0" name="shot-policy.png"/>
+                    <pic:cNvPicPr/>
+                  </pic:nvPicPr>
+                  <pic:blipFill>
+                    <a:blip r:embed="rId19"/>
+                    <a:stretch>
+                      <a:fillRect/>
+                    </a:stretch>
+                  </pic:blipFill>
+                  <pic:spPr>
+                    <a:xfrm>
+                      <a:off x="0" y="0"/>
+                      <a:ext cx="5852160" cy="3291840"/>
+                    </a:xfrm>
+                    <a:prstGeom prst="rect"/>
+                  </pic:spPr>
+                </pic:pic>
+              </a:graphicData>
+            </a:graphic>
+          </wp:inline>
+        </w:drawing>
+      </w:r>
+    </w:p>
+    <w:p>
+      <w:pPr>
+        <w:spacing w:after="120"/>
+      </w:pPr>
+      <w:r>
+        <w:rPr>
+          <w:b/>
+          <w:color w:val="1B3A6B"/>
+        </w:rPr>
+        <w:t>Settings</w:t>
+      </w:r>
+      <w:r>
+        <w:t xml:space="preserve"> - organisation, team, notifications, API keys, integrations. Team</w:t>
+      </w:r>
+    </w:p>
+    <w:p>
+      <w:pPr>
+        <w:spacing w:after="120"/>
+      </w:pPr>
+      <w:r>
+        <w:t>members and API keys are live (real users from the API, keys issued and revoked</w:t>
+      </w:r>
+    </w:p>
+    <w:p>
+      <w:pPr>
+        <w:spacing w:after="120"/>
+      </w:pPr>
+      <w:r>
+        <w:t>from this screen); the organisation form and notification toggles are</w:t>
+      </w:r>
+    </w:p>
+    <w:p>
+      <w:pPr>
+        <w:spacing w:after="120"/>
+      </w:pPr>
+      <w:r>
+        <w:t>client-side only in this release, and the integrations tab honestly reports</w:t>
+      </w:r>
+    </w:p>
+    <w:p>
+      <w:pPr>
+        <w:spacing w:after="120"/>
+      </w:pPr>
+      <w:r>
+        <w:t>every integration as not connected rather than faking a status.</w:t>
+      </w:r>
+    </w:p>
+    <w:p>
+      <w:r>
+        <w:drawing>
+          <wp:inline xmlns:a="http://schemas.openxmlformats.org/drawingml/2006/main" xmlns:pic="http://schemas.openxmlformats.org/drawingml/2006/picture">
+            <wp:extent cx="5852160" cy="3291840"/>
+            <wp:docPr id="11" name="Picture 11"/>
+            <wp:cNvGraphicFramePr>
+              <a:graphicFrameLocks noChangeAspect="1"/>
+            </wp:cNvGraphicFramePr>
+            <a:graphic>
+              <a:graphicData uri="http://schemas.openxmlformats.org/drawingml/2006/picture">
+                <pic:pic>
+                  <pic:nvPicPr>
+                    <pic:cNvPr id="0" name="shot-settings.png"/>
+                    <pic:cNvPicPr/>
+                  </pic:nvPicPr>
+                  <pic:blipFill>
+                    <a:blip r:embed="rId20"/>
+                    <a:stretch>
+                      <a:fillRect/>
+                    </a:stretch>
+                  </pic:blipFill>
+                  <pic:spPr>
+                    <a:xfrm>
+                      <a:off x="0" y="0"/>
+                      <a:ext cx="5852160" cy="3291840"/>
+                    </a:xfrm>
+                    <a:prstGeom prst="rect"/>
+                  </pic:spPr>
+                </pic:pic>
+              </a:graphicData>
+            </a:graphic>
+          </wp:inline>
+        </w:drawing>
       </w:r>
     </w:p>
     <w:p>
@@ -1209,6 +1799,346 @@
         <w:t xml:space="preserve">  give a self-contained walkthrough.</w:t>
       </w:r>
     </w:p>
+    <w:p>
+      <w:pPr>
+        <w:spacing w:before="280"/>
+      </w:pPr>
+      <w:r>
+        <w:rPr>
+          <w:b/>
+          <w:color w:val="1B3A6B"/>
+          <w:sz w:val="26"/>
+        </w:rPr>
+        <w:t>5. A3 marking feedback applied</w:t>
+      </w:r>
+    </w:p>
+    <w:p>
+      <w:pPr>
+        <w:spacing w:after="120"/>
+      </w:pPr>
+      <w:r>
+        <w:t>The A3 assessment feedback listed specific improvements. Point by point:</w:t>
+      </w:r>
+    </w:p>
+    <w:tbl>
+      <w:tblPr>
+        <w:tblStyle w:val="TableGrid"/>
+        <w:tblW w:type="auto" w:w="0"/>
+        <w:jc w:val="center"/>
+        <w:tblLook w:firstColumn="1" w:firstRow="1" w:lastColumn="0" w:lastRow="0" w:noHBand="0" w:noVBand="1" w:val="04A0"/>
+      </w:tblPr>
+      <w:tblGrid>
+        <w:gridCol w:w="5328"/>
+        <w:gridCol w:w="5328"/>
+      </w:tblGrid>
+      <w:tr>
+        <w:tc>
+          <w:tcPr>
+            <w:tcW w:type="dxa" w:w="5328"/>
+            <w:shd w:val="clear" w:fill="1B3A6B"/>
+          </w:tcPr>
+          <w:p>
+            <w:r/>
+            <w:r>
+              <w:rPr>
+                <w:b/>
+                <w:color w:val="FFFFFF"/>
+                <w:sz w:val="15"/>
+              </w:rPr>
+              <w:t>A3 FEEDBACK</w:t>
+            </w:r>
+          </w:p>
+        </w:tc>
+        <w:tc>
+          <w:tcPr>
+            <w:tcW w:type="dxa" w:w="5328"/>
+            <w:shd w:val="clear" w:fill="1B3A6B"/>
+          </w:tcPr>
+          <w:p>
+            <w:r/>
+            <w:r>
+              <w:rPr>
+                <w:b/>
+                <w:color w:val="FFFFFF"/>
+                <w:sz w:val="15"/>
+              </w:rPr>
+              <w:t>WHAT WE DID IN A4</w:t>
+            </w:r>
+          </w:p>
+        </w:tc>
+      </w:tr>
+      <w:tr>
+        <w:tc>
+          <w:tcPr>
+            <w:tcW w:type="dxa" w:w="5328"/>
+          </w:tcPr>
+          <w:p>
+            <w:pPr>
+              <w:spacing w:after="20"/>
+            </w:pPr>
+            <w:r>
+              <w:rPr>
+                <w:sz w:val="16"/>
+              </w:rPr>
+            </w:r>
+            <w:r>
+              <w:rPr>
+                <w:sz w:val="16"/>
+              </w:rPr>
+              <w:t>"Only a limited number of interface screens are presented"</w:t>
+            </w:r>
+          </w:p>
+        </w:tc>
+        <w:tc>
+          <w:tcPr>
+            <w:tcW w:type="dxa" w:w="5328"/>
+          </w:tcPr>
+          <w:p>
+            <w:pPr>
+              <w:spacing w:after="20"/>
+            </w:pPr>
+            <w:r>
+              <w:rPr>
+                <w:sz w:val="16"/>
+              </w:rPr>
+            </w:r>
+            <w:r>
+              <w:rPr>
+                <w:sz w:val="16"/>
+              </w:rPr>
+              <w:t>All ten screens are implemented and shown in section 3, captured from the live system - none are mockups</w:t>
+            </w:r>
+          </w:p>
+        </w:tc>
+      </w:tr>
+      <w:tr>
+        <w:tc>
+          <w:tcPr>
+            <w:tcW w:type="dxa" w:w="5328"/>
+            <w:shd w:val="clear" w:fill="F7F9FC"/>
+          </w:tcPr>
+          <w:p>
+            <w:pPr>
+              <w:spacing w:after="20"/>
+            </w:pPr>
+            <w:r>
+              <w:rPr>
+                <w:sz w:val="16"/>
+              </w:rPr>
+            </w:r>
+            <w:r>
+              <w:rPr>
+                <w:sz w:val="16"/>
+              </w:rPr>
+              <w:t>"Additional screenshots for all designed screens would make the screen flow even clearer"</w:t>
+            </w:r>
+          </w:p>
+        </w:tc>
+        <w:tc>
+          <w:tcPr>
+            <w:tcW w:type="dxa" w:w="5328"/>
+            <w:shd w:val="clear" w:fill="F7F9FC"/>
+          </w:tcPr>
+          <w:p>
+            <w:pPr>
+              <w:spacing w:after="20"/>
+            </w:pPr>
+            <w:r>
+              <w:rPr>
+                <w:sz w:val="16"/>
+              </w:rPr>
+            </w:r>
+            <w:r>
+              <w:rPr>
+                <w:sz w:val="16"/>
+              </w:rPr>
+              <w:t>The section 3 gallery is ordered along the two persona journeys, so the flow reads top to bottom</w:t>
+            </w:r>
+          </w:p>
+        </w:tc>
+      </w:tr>
+      <w:tr>
+        <w:tc>
+          <w:tcPr>
+            <w:tcW w:type="dxa" w:w="5328"/>
+          </w:tcPr>
+          <w:p>
+            <w:pPr>
+              <w:spacing w:after="20"/>
+            </w:pPr>
+            <w:r>
+              <w:rPr>
+                <w:sz w:val="16"/>
+              </w:rPr>
+            </w:r>
+            <w:r>
+              <w:rPr>
+                <w:sz w:val="16"/>
+              </w:rPr>
+              <w:t>Design approval "should be presented more consistently"</w:t>
+            </w:r>
+          </w:p>
+        </w:tc>
+        <w:tc>
+          <w:tcPr>
+            <w:tcW w:type="dxa" w:w="5328"/>
+          </w:tcPr>
+          <w:p>
+            <w:pPr>
+              <w:spacing w:after="20"/>
+            </w:pPr>
+            <w:r>
+              <w:rPr>
+                <w:sz w:val="16"/>
+              </w:rPr>
+            </w:r>
+            <w:r>
+              <w:rPr>
+                <w:sz w:val="16"/>
+              </w:rPr>
+              <w:t>The approval record now lives in exactly one place - the sign-off box in the contribution table appendix - and no other document makes an approval claim</w:t>
+            </w:r>
+          </w:p>
+        </w:tc>
+      </w:tr>
+      <w:tr>
+        <w:tc>
+          <w:tcPr>
+            <w:tcW w:type="dxa" w:w="5328"/>
+            <w:shd w:val="clear" w:fill="F7F9FC"/>
+          </w:tcPr>
+          <w:p>
+            <w:pPr>
+              <w:spacing w:after="20"/>
+            </w:pPr>
+            <w:r>
+              <w:rPr>
+                <w:sz w:val="16"/>
+              </w:rPr>
+            </w:r>
+            <w:r>
+              <w:rPr>
+                <w:sz w:val="16"/>
+              </w:rPr>
+              <w:t>"Provide additional user testing or usability evaluation"</w:t>
+            </w:r>
+          </w:p>
+        </w:tc>
+        <w:tc>
+          <w:tcPr>
+            <w:tcW w:type="dxa" w:w="5328"/>
+            <w:shd w:val="clear" w:fill="F7F9FC"/>
+          </w:tcPr>
+          <w:p>
+            <w:pPr>
+              <w:spacing w:after="20"/>
+            </w:pPr>
+            <w:r>
+              <w:rPr>
+                <w:sz w:val="16"/>
+              </w:rPr>
+            </w:r>
+            <w:r>
+              <w:rPr>
+                <w:sz w:val="16"/>
+              </w:rPr>
+              <w:t>New Usability Evaluation appendix: a heuristic walkthrough and WCAG 2.1 AA audit of the live deployment, plus the sponsor, supervisor and exhibition feedback and what each changed</w:t>
+            </w:r>
+          </w:p>
+        </w:tc>
+      </w:tr>
+      <w:tr>
+        <w:tc>
+          <w:tcPr>
+            <w:tcW w:type="dxa" w:w="5328"/>
+          </w:tcPr>
+          <w:p>
+            <w:pPr>
+              <w:spacing w:after="20"/>
+            </w:pPr>
+            <w:r>
+              <w:rPr>
+                <w:sz w:val="16"/>
+              </w:rPr>
+            </w:r>
+            <w:r>
+              <w:rPr>
+                <w:sz w:val="16"/>
+              </w:rPr>
+              <w:t>"Continue implementing the frontend and backend to demonstrate the complete governance platform"</w:t>
+            </w:r>
+          </w:p>
+        </w:tc>
+        <w:tc>
+          <w:tcPr>
+            <w:tcW w:type="dxa" w:w="5328"/>
+          </w:tcPr>
+          <w:p>
+            <w:pPr>
+              <w:spacing w:after="20"/>
+            </w:pPr>
+            <w:r>
+              <w:rPr>
+                <w:sz w:val="16"/>
+              </w:rPr>
+            </w:r>
+            <w:r>
+              <w:rPr>
+                <w:sz w:val="16"/>
+              </w:rPr>
+              <w:t>The A4 submission is that: the full platform live on Azure, 105 passing tests, and a real agent (OpenClaw) governed through it</w:t>
+            </w:r>
+          </w:p>
+        </w:tc>
+      </w:tr>
+      <w:tr>
+        <w:tc>
+          <w:tcPr>
+            <w:tcW w:type="dxa" w:w="5328"/>
+            <w:shd w:val="clear" w:fill="F7F9FC"/>
+          </w:tcPr>
+          <w:p>
+            <w:pPr>
+              <w:spacing w:after="20"/>
+            </w:pPr>
+            <w:r>
+              <w:rPr>
+                <w:sz w:val="16"/>
+              </w:rPr>
+            </w:r>
+            <w:r>
+              <w:rPr>
+                <w:sz w:val="16"/>
+              </w:rPr>
+              <w:t>"Ensure all group members actively contribute during demonstrations and clearly explain their individual design contributions"</w:t>
+            </w:r>
+          </w:p>
+        </w:tc>
+        <w:tc>
+          <w:tcPr>
+            <w:tcW w:type="dxa" w:w="5328"/>
+            <w:shd w:val="clear" w:fill="F7F9FC"/>
+          </w:tcPr>
+          <w:p>
+            <w:pPr>
+              <w:spacing w:after="20"/>
+            </w:pPr>
+            <w:r>
+              <w:rPr>
+                <w:sz w:val="16"/>
+              </w:rPr>
+            </w:r>
+            <w:r>
+              <w:rPr>
+                <w:sz w:val="16"/>
+              </w:rPr>
+              <w:t>Each member's individual contribution is recorded and signed in the contribution table appendix</w:t>
+            </w:r>
+          </w:p>
+        </w:tc>
+      </w:tr>
+    </w:tbl>
+    <w:p/>
     <w:sectPr>
       <w:footerReference w:type="default" r:id="rId9"/>
       <w:pgSz w:w="12240" w:h="15840"/>

</xml_diff>